<commit_message>
Add align parameter to control horizontal drawing alignment on the page
build_diagram_xml() gains align = c("center", "left", "right"), default
"center". make_super_anchor() maps this to the DrawingML anchor positionH
element: center/right use <wp:align> relative to the text column; left uses
<wp:posOffset>0</wp:posOffset> at the column edge. The parameter passes
through mermaid_to_word() / body_add_mermaid() via the existing ... mechanism.

Co-Authored-By: Claude Sonnet 4.6 <noreply@anthropic.com>
</commit_message>
<xml_diff>
--- a/dev/documents.docx
+++ b/dev/documents.docx
@@ -12,8 +12,8 @@
             <w:drawing>
               <wp:anchor distT="0" distB="0" distL="114300" distR="114300" simplePos="0" relativeHeight="251658240" behindDoc="0" locked="0" layoutInCell="1" allowOverlap="1">
                 <wp:simplePos x="0" y="0"/>
-                <wp:positionH relativeFrom="page">
-                  <wp:posOffset>457200</wp:posOffset>
+                <wp:positionH relativeFrom="column">
+                  <wp:align>center</wp:align>
                 </wp:positionH>
                 <wp:positionV relativeFrom="page">
                   <wp:posOffset>457200</wp:posOffset>

</xml_diff>